<commit_message>
Refresh planning doc + README to reflect Phase C optimization
planning doc:
  Replaced with the user's most-recent revision (clearer post-2020
  filter note, 100%-compute initial training, doc_blended scheme
  description matching what's implemented, plus a class-report
  skeleton appended at the bottom).

README.md (top-level):
  Updated headline run section to document the four sequential
  phases now in run_planning_doc.py:
    A — cadence sweep (all-on procurement)
    B — locked-cadence diagnostic
    C — procurement optimization (fixed costs included)
    Verification — cadence under optimal procurement
    Final hourly — saved for the joint optimum

  Latest smoke test (N=3): 30d × (LMP + Houston toll, no BESS) →
  $95,044.11M. Verification confirmed 30d cadence under LMP+toll.

Co-Authored-By: Claude Opus 4.7 (1M context) <noreply@anthropic.com>
</commit_message>
<xml_diff>
--- a/Final Project Planning .docx
+++ b/Final Project Planning .docx
@@ -41,7 +41,7 @@
           <w:pgNumType w:start="1"/>
         </w:sectPr>
       </w:pPr>
-      <w:bookmarkStart w:colFirst="0" w:colLast="0" w:name="_zf0fijzg775j" w:id="0"/>
+      <w:bookmarkStart w:colFirst="0" w:colLast="0" w:name="_nhdivvnxumju" w:id="0"/>
       <w:bookmarkEnd w:id="0"/>
       <w:r>
         <w:rPr>
@@ -60,7 +60,7 @@
           <w:vertAlign w:val="baseline"/>
           <w:rtl w:val="0"/>
         </w:rPr>
-        <w:t xml:space="preserve">Tab 1</w:t>
+        <w:t xml:space="preserve">Project description</w:t>
       </w:r>
       <w:r>
         <w:rPr>
@@ -319,7 +319,7 @@
           <w:pgNumType w:start="1"/>
         </w:sectPr>
       </w:pPr>
-      <w:bookmarkStart w:colFirst="0" w:colLast="0" w:name="_okgm5sqs3lvl" w:id="1"/>
+      <w:bookmarkStart w:colFirst="0" w:colLast="0" w:name="_r99oj56gqgwy" w:id="1"/>
       <w:bookmarkEnd w:id="1"/>
       <w:r>
         <w:rPr>
@@ -481,14 +481,14 @@
         <w:rPr/>
         <w:drawing>
           <wp:inline distB="114300" distT="114300" distL="114300" distR="114300">
-            <wp:extent cx="3319463" cy="2366654"/>
+            <wp:extent cx="5557838" cy="3949409"/>
             <wp:effectExtent b="0" l="0" r="0" t="0"/>
-            <wp:docPr id="11" name="image4.png"/>
+            <wp:docPr id="2" name="image2.png"/>
             <a:graphic>
               <a:graphicData uri="http://schemas.openxmlformats.org/drawingml/2006/picture">
                 <pic:pic>
                   <pic:nvPicPr>
-                    <pic:cNvPr id="0" name="image4.png"/>
+                    <pic:cNvPr id="0" name="image2.png"/>
                     <pic:cNvPicPr preferRelativeResize="0"/>
                   </pic:nvPicPr>
                   <pic:blipFill>
@@ -501,7 +501,7 @@
                   <pic:spPr>
                     <a:xfrm>
                       <a:off x="0" y="0"/>
-                      <a:ext cx="3319463" cy="2366654"/>
+                      <a:ext cx="5557838" cy="3949409"/>
                     </a:xfrm>
                     <a:prstGeom prst="rect"/>
                     <a:ln/>
@@ -518,12 +518,12 @@
           <wp:inline distB="114300" distT="114300" distL="114300" distR="114300">
             <wp:extent cx="3519488" cy="2739601"/>
             <wp:effectExtent b="0" l="0" r="0" t="0"/>
-            <wp:docPr id="3" name="image8.png"/>
+            <wp:docPr id="7" name="image7.png"/>
             <a:graphic>
               <a:graphicData uri="http://schemas.openxmlformats.org/drawingml/2006/picture">
                 <pic:pic>
                   <pic:nvPicPr>
-                    <pic:cNvPr id="0" name="image8.png"/>
+                    <pic:cNvPr id="0" name="image7.png"/>
                     <pic:cNvPicPr preferRelativeResize="0"/>
                   </pic:nvPicPr>
                   <pic:blipFill>
@@ -561,7 +561,7 @@
         <w:rPr>
           <w:rtl w:val="0"/>
         </w:rPr>
-        <w:t xml:space="preserve">Based on the first graph, we see that the number of parameters within A.I. datasets have been increasing at an exponential rate, especially given the visually positive linear relationship on a logarithmic y-axis. We first restricted the dataset to post-2010 data. Therefore, extracting this relationship with a 0.202 R</w:t>
+        <w:t xml:space="preserve">Based on the first graph, we see that the number of parameters within A.I. datasets have been increasing at an exponential rate, especially given the visually positive linear relationship on a logarithmic y-axis. We first restricted the dataset to post-2020 data. Therefore, extracting this relationship with a 0.202 R</w:t>
       </w:r>
       <w:r>
         <w:rPr>
@@ -587,7 +587,7 @@
         <w:rPr>
           <w:rtl w:val="0"/>
         </w:rPr>
-        <w:t xml:space="preserve"> where x is the date in number format. As an example, we will assume that the industry standard of AI model releases is every 2 months (this will actually be variable in our model) after the first training time of 3 weeks. In other words, with regards to this project, our trainings will be on 6/01/2026 (model release on 6/22/2026), 6/22/2026 (model release on 8/22/2026), 8/22/2026 (model release on 10/22/2026), 10/22/2026 (model release on 12/22/2026, will not see revenue for this report). These dates will have a projected number of parameters of 258,564,055,666, 270,221,896,618, 307,152,221,682, 349,129,691,061, 379,273,539,685, respectively based on buildout until mid 2023. However, based on recent speed-up, if we want to be competitive with the most aggressive models (GPT 4o, Claude, Copilot, etc.), we need to increase this parameter count by a factor of 5-10x with reference to the latest models like DeepSeek Pro at 1.6T parameters, Xiaomi Mimo at 1.02T, ChatGPT-4 at 1.7T+, etc.. Therefore,  we will use a 5x multiplier on our model to get 1,292,820,278,329, 1,351,109,483,088, 1,535,761,108,408, 1,745,648,455,305, and 1,898,617,498,423 parameters.</w:t>
+        <w:t xml:space="preserve"> where x is the date in number format. As an example, we will assume that the industry standard of AI model releases is every 2 months (this will actually be variable in our model) after the first training time with 100% compute into training the initial model. In other words, with regards to this project, an example training would be on 6/01/2026 (model release on 6/22/2026), 6/22/2026 (model release on 8/22/2026), 8/22/2026 (model release on 10/22/2026), 10/22/2026 (model release on 12/22/2026, will not see revenue for this report). These dates will have a projected number of parameters of 258,564,055,666, 270,221,896,618, 307,152,221,682, 349,129,691,061, 379,273,539,685, respectively based on buildout until mid 2023. However, based on recent speed-up, if we want to be competitive with the most aggressive models (GPT 4o, Claude, Copilot, etc.), we need to increase this parameter count by a factor of 5-10x with reference to the latest models like DeepSeek Pro at 1.6T parameters, Xiaomi Mimo at 1.02T, ChatGPT-4 at 1.7T+, etc.. Therefore,  we will use a 5x multiplier on our model to get 1,292,820,278,329, 1,351,109,483,088, 1,535,761,108,408, 1,745,648,455,305, and 1,898,617,498,423 parameters.</w:t>
       </w:r>
     </w:p>
     <w:p>
@@ -1191,12 +1191,12 @@
           <wp:inline distB="114300" distT="114300" distL="114300" distR="114300">
             <wp:extent cx="5943600" cy="419100"/>
             <wp:effectExtent b="0" l="0" r="0" t="0"/>
-            <wp:docPr id="8" name="image5.png"/>
+            <wp:docPr id="5" name="image6.png"/>
             <a:graphic>
               <a:graphicData uri="http://schemas.openxmlformats.org/drawingml/2006/picture">
                 <pic:pic>
                   <pic:nvPicPr>
-                    <pic:cNvPr id="0" name="image5.png"/>
+                    <pic:cNvPr id="0" name="image6.png"/>
                     <pic:cNvPicPr preferRelativeResize="0"/>
                   </pic:nvPicPr>
                   <pic:blipFill>
@@ -1276,12 +1276,12 @@
           <wp:inline distB="114300" distT="114300" distL="114300" distR="114300">
             <wp:extent cx="5238750" cy="571500"/>
             <wp:effectExtent b="0" l="0" r="0" t="0"/>
-            <wp:docPr id="10" name="image3.png"/>
+            <wp:docPr id="1" name="image1.png"/>
             <a:graphic>
               <a:graphicData uri="http://schemas.openxmlformats.org/drawingml/2006/picture">
                 <pic:pic>
                   <pic:nvPicPr>
-                    <pic:cNvPr id="0" name="image3.png"/>
+                    <pic:cNvPr id="0" name="image1.png"/>
                     <pic:cNvPicPr preferRelativeResize="0"/>
                   </pic:nvPicPr>
                   <pic:blipFill>
@@ -1344,12 +1344,12 @@
           <wp:inline distB="114300" distT="114300" distL="114300" distR="114300">
             <wp:extent cx="5286375" cy="571500"/>
             <wp:effectExtent b="0" l="0" r="0" t="0"/>
-            <wp:docPr id="12" name="image6.png"/>
+            <wp:docPr id="6" name="image8.png"/>
             <a:graphic>
               <a:graphicData uri="http://schemas.openxmlformats.org/drawingml/2006/picture">
                 <pic:pic>
                   <pic:nvPicPr>
-                    <pic:cNvPr id="0" name="image6.png"/>
+                    <pic:cNvPr id="0" name="image8.png"/>
                     <pic:cNvPicPr preferRelativeResize="0"/>
                   </pic:nvPicPr>
                   <pic:blipFill>
@@ -1418,12 +1418,12 @@
           <wp:inline distB="114300" distT="114300" distL="114300" distR="114300">
             <wp:extent cx="5943600" cy="419100"/>
             <wp:effectExtent b="0" l="0" r="0" t="0"/>
-            <wp:docPr id="7" name="image2.png"/>
+            <wp:docPr id="4" name="image3.png"/>
             <a:graphic>
               <a:graphicData uri="http://schemas.openxmlformats.org/drawingml/2006/picture">
                 <pic:pic>
                   <pic:nvPicPr>
-                    <pic:cNvPr id="0" name="image2.png"/>
+                    <pic:cNvPr id="0" name="image3.png"/>
                     <pic:cNvPicPr preferRelativeResize="0"/>
                   </pic:nvPicPr>
                   <pic:blipFill>
@@ -1481,7 +1481,7 @@
           <w:pgNumType w:start="1"/>
         </w:sectPr>
       </w:pPr>
-      <w:bookmarkStart w:colFirst="0" w:colLast="0" w:name="_ypaqcsvzs02e" w:id="2"/>
+      <w:bookmarkStart w:colFirst="0" w:colLast="0" w:name="_kqajt81lkqct" w:id="2"/>
       <w:bookmarkEnd w:id="2"/>
       <w:r>
         <w:rPr>
@@ -1550,7 +1550,7 @@
           <w:pgNumType w:start="1"/>
         </w:sectPr>
       </w:pPr>
-      <w:bookmarkStart w:colFirst="0" w:colLast="0" w:name="_7wbiafpxkvja" w:id="3"/>
+      <w:bookmarkStart w:colFirst="0" w:colLast="0" w:name="_aouous1zpgzn" w:id="3"/>
       <w:bookmarkEnd w:id="3"/>
       <w:r>
         <w:rPr>
@@ -1791,12 +1791,12 @@
           <wp:inline distB="114300" distT="114300" distL="114300" distR="114300">
             <wp:extent cx="5943600" cy="419100"/>
             <wp:effectExtent b="0" l="0" r="0" t="0"/>
-            <wp:docPr id="6" name="image5.png"/>
+            <wp:docPr id="3" name="image6.png"/>
             <a:graphic>
               <a:graphicData uri="http://schemas.openxmlformats.org/drawingml/2006/picture">
                 <pic:pic>
                   <pic:nvPicPr>
-                    <pic:cNvPr id="0" name="image5.png"/>
+                    <pic:cNvPr id="0" name="image6.png"/>
                     <pic:cNvPicPr preferRelativeResize="0"/>
                   </pic:nvPicPr>
                   <pic:blipFill>
@@ -1876,12 +1876,12 @@
           <wp:inline distB="114300" distT="114300" distL="114300" distR="114300">
             <wp:extent cx="5238750" cy="571500"/>
             <wp:effectExtent b="0" l="0" r="0" t="0"/>
-            <wp:docPr id="1" name="image3.png"/>
+            <wp:docPr id="10" name="image1.png"/>
             <a:graphic>
               <a:graphicData uri="http://schemas.openxmlformats.org/drawingml/2006/picture">
                 <pic:pic>
                   <pic:nvPicPr>
-                    <pic:cNvPr id="0" name="image3.png"/>
+                    <pic:cNvPr id="0" name="image1.png"/>
                     <pic:cNvPicPr preferRelativeResize="0"/>
                   </pic:nvPicPr>
                   <pic:blipFill>
@@ -1944,12 +1944,12 @@
           <wp:inline distB="114300" distT="114300" distL="114300" distR="114300">
             <wp:extent cx="5286375" cy="571500"/>
             <wp:effectExtent b="0" l="0" r="0" t="0"/>
-            <wp:docPr id="9" name="image6.png"/>
+            <wp:docPr id="12" name="image8.png"/>
             <a:graphic>
               <a:graphicData uri="http://schemas.openxmlformats.org/drawingml/2006/picture">
                 <pic:pic>
                   <pic:nvPicPr>
-                    <pic:cNvPr id="0" name="image6.png"/>
+                    <pic:cNvPr id="0" name="image8.png"/>
                     <pic:cNvPicPr preferRelativeResize="0"/>
                   </pic:nvPicPr>
                   <pic:blipFill>
@@ -2012,12 +2012,12 @@
           <wp:inline distB="114300" distT="114300" distL="114300" distR="114300">
             <wp:extent cx="5943600" cy="419100"/>
             <wp:effectExtent b="0" l="0" r="0" t="0"/>
-            <wp:docPr id="2" name="image2.png"/>
+            <wp:docPr id="11" name="image3.png"/>
             <a:graphic>
               <a:graphicData uri="http://schemas.openxmlformats.org/drawingml/2006/picture">
                 <pic:pic>
                   <pic:nvPicPr>
-                    <pic:cNvPr id="0" name="image2.png"/>
+                    <pic:cNvPr id="0" name="image3.png"/>
                     <pic:cNvPicPr preferRelativeResize="0"/>
                   </pic:nvPicPr>
                   <pic:blipFill>
@@ -2191,9 +2191,13 @@
           <w:numId w:val="1"/>
         </w:numPr>
         <w:ind w:left="720" w:hanging="360"/>
-      </w:pPr>
-      <w:r>
-        <w:rPr>
+        <w:rPr>
+          <w:highlight w:val="yellow"/>
+        </w:rPr>
+      </w:pPr>
+      <w:r>
+        <w:rPr>
+          <w:highlight w:val="yellow"/>
           <w:rtl w:val="0"/>
         </w:rPr>
         <w:t xml:space="preserve">Chosen H-100 hardware giving us computational ability for our datacenters (teraFLOP capacity for both SXM/PCIe specs)</w:t>
@@ -2266,12 +2270,12 @@
           <wp:inline distB="114300" distT="114300" distL="114300" distR="114300">
             <wp:extent cx="3276600" cy="247650"/>
             <wp:effectExtent b="0" l="0" r="0" t="0"/>
-            <wp:docPr id="5" name="image7.png"/>
+            <wp:docPr id="8" name="image4.png"/>
             <a:graphic>
               <a:graphicData uri="http://schemas.openxmlformats.org/drawingml/2006/picture">
                 <pic:pic>
                   <pic:nvPicPr>
-                    <pic:cNvPr id="0" name="image7.png"/>
+                    <pic:cNvPr id="0" name="image4.png"/>
                     <pic:cNvPicPr preferRelativeResize="0"/>
                   </pic:nvPicPr>
                   <pic:blipFill>
@@ -2316,12 +2320,12 @@
           <wp:inline distB="114300" distT="114300" distL="114300" distR="114300">
             <wp:extent cx="3238500" cy="247650"/>
             <wp:effectExtent b="0" l="0" r="0" t="0"/>
-            <wp:docPr id="4" name="image1.png"/>
+            <wp:docPr id="9" name="image5.png"/>
             <a:graphic>
               <a:graphicData uri="http://schemas.openxmlformats.org/drawingml/2006/picture">
                 <pic:pic>
                   <pic:nvPicPr>
-                    <pic:cNvPr id="0" name="image1.png"/>
+                    <pic:cNvPr id="0" name="image5.png"/>
                     <pic:cNvPicPr preferRelativeResize="0"/>
                   </pic:nvPicPr>
                   <pic:blipFill>
@@ -2409,7 +2413,7 @@
           <w:highlight w:val="yellow"/>
           <w:rtl w:val="0"/>
         </w:rPr>
-        <w:t xml:space="preserve">Token cost per model (forecasted per AI model release)</w:t>
+        <w:t xml:space="preserve">Token cost per model (forecasted per AI model release or over time using exponential price decay)</w:t>
       </w:r>
     </w:p>
     <w:p>
@@ -2428,7 +2432,7 @@
           <w:highlight w:val="yellow"/>
           <w:rtl w:val="0"/>
         </w:rPr>
-        <w:t xml:space="preserve"># of tokens per request (forecasted per AI model release)</w:t>
+        <w:t xml:space="preserve"># of tokens per request (forecasted per AI model release or over time using historical data)</w:t>
       </w:r>
     </w:p>
     <w:p>
@@ -2510,11 +2514,593 @@
     <w:p>
       <w:pPr>
         <w:rPr/>
-      </w:pPr>
-      <w:r>
-        <w:rPr>
-          <w:rtl w:val="0"/>
-        </w:rPr>
+        <w:sectPr>
+          <w:type w:val="nextPage"/>
+          <w:pgSz w:h="15840" w:w="12240" w:orient="portrait"/>
+          <w:pgMar w:bottom="1440" w:top="1440" w:left="1440" w:right="1440" w:header="720" w:footer="720"/>
+          <w:pgNumType w:start="1"/>
+        </w:sectPr>
+      </w:pPr>
+      <w:r>
+        <w:rPr>
+          <w:rtl w:val="0"/>
+        </w:rPr>
+      </w:r>
+    </w:p>
+    <w:p>
+      <w:pPr>
+        <w:pStyle w:val="Title"/>
+        <w:keepNext w:val="0"/>
+        <w:keepLines w:val="0"/>
+        <w:pageBreakBefore w:val="0"/>
+        <w:widowControl w:val="0"/>
+        <w:pBdr>
+          <w:top w:space="0" w:sz="0" w:val="nil"/>
+          <w:left w:space="0" w:sz="0" w:val="nil"/>
+          <w:bottom w:space="0" w:sz="0" w:val="nil"/>
+          <w:right w:space="0" w:sz="0" w:val="nil"/>
+          <w:between w:space="0" w:sz="0" w:val="nil"/>
+        </w:pBdr>
+        <w:shd w:fill="auto" w:val="clear"/>
+        <w:spacing w:after="0" w:before="0" w:line="276" w:lineRule="auto"/>
+        <w:ind w:left="0" w:right="0" w:firstLine="0"/>
+        <w:jc w:val="left"/>
+        <w:rPr/>
+        <w:sectPr>
+          <w:type w:val="nextPage"/>
+          <w:pgSz w:h="15840" w:w="12240" w:orient="portrait"/>
+          <w:pgMar w:bottom="1440" w:top="1440" w:left="1440" w:right="1440" w:header="720" w:footer="720"/>
+          <w:pgNumType w:start="1"/>
+        </w:sectPr>
+      </w:pPr>
+      <w:bookmarkStart w:colFirst="0" w:colLast="0" w:name="_2stxd584n73i" w:id="4"/>
+      <w:bookmarkEnd w:id="4"/>
+      <w:r>
+        <w:rPr>
+          <w:rFonts w:ascii="Arial" w:cs="Arial" w:eastAsia="Arial" w:hAnsi="Arial"/>
+          <w:b w:val="0"/>
+          <w:bCs w:val="0"/>
+          <w:i w:val="0"/>
+          <w:iCs w:val="0"/>
+          <w:smallCaps w:val="0"/>
+          <w:strike w:val="0"/>
+          <w:color w:val="000000"/>
+          <w:sz w:val="52"/>
+          <w:szCs w:val="52"/>
+          <w:u w:val="none"/>
+          <w:shd w:fill="auto" w:val="clear"/>
+          <w:vertAlign w:val="baseline"/>
+          <w:rtl w:val="0"/>
+        </w:rPr>
+        <w:t xml:space="preserve">Report</w:t>
+      </w:r>
+      <w:r>
+        <w:rPr>
+          <w:rtl w:val="0"/>
+        </w:rPr>
+      </w:r>
+    </w:p>
+    <w:p>
+      <w:pPr>
+        <w:rPr>
+          <w:sz w:val="30"/>
+          <w:szCs w:val="30"/>
+        </w:rPr>
+      </w:pPr>
+      <w:r>
+        <w:rPr>
+          <w:sz w:val="30"/>
+          <w:szCs w:val="30"/>
+          <w:rtl w:val="0"/>
+        </w:rPr>
+        <w:t xml:space="preserve">Executive Summary</w:t>
+      </w:r>
+    </w:p>
+    <w:p>
+      <w:pPr>
+        <w:rPr>
+          <w:sz w:val="30"/>
+          <w:szCs w:val="30"/>
+        </w:rPr>
+      </w:pPr>
+      <w:r>
+        <w:rPr>
+          <w:rtl w:val="0"/>
+        </w:rPr>
+      </w:r>
+    </w:p>
+    <w:p>
+      <w:pPr>
+        <w:rPr>
+          <w:sz w:val="30"/>
+          <w:szCs w:val="30"/>
+        </w:rPr>
+      </w:pPr>
+      <w:r>
+        <w:rPr>
+          <w:rtl w:val="0"/>
+        </w:rPr>
+      </w:r>
+    </w:p>
+    <w:p>
+      <w:pPr>
+        <w:rPr>
+          <w:sz w:val="30"/>
+          <w:szCs w:val="30"/>
+        </w:rPr>
+      </w:pPr>
+      <w:r>
+        <w:rPr>
+          <w:sz w:val="30"/>
+          <w:szCs w:val="30"/>
+          <w:rtl w:val="0"/>
+        </w:rPr>
+        <w:t xml:space="preserve">Model Setup</w:t>
+      </w:r>
+    </w:p>
+    <w:p>
+      <w:pPr>
+        <w:rPr>
+          <w:sz w:val="28"/>
+          <w:szCs w:val="28"/>
+        </w:rPr>
+      </w:pPr>
+      <w:r>
+        <w:rPr>
+          <w:sz w:val="28"/>
+          <w:szCs w:val="28"/>
+          <w:rtl w:val="0"/>
+        </w:rPr>
+        <w:t xml:space="preserve">Inference + Training</w:t>
+      </w:r>
+    </w:p>
+    <w:p>
+      <w:pPr>
+        <w:rPr>
+          <w:sz w:val="26"/>
+          <w:szCs w:val="26"/>
+        </w:rPr>
+      </w:pPr>
+      <w:r>
+        <w:rPr>
+          <w:sz w:val="26"/>
+          <w:szCs w:val="26"/>
+          <w:rtl w:val="0"/>
+        </w:rPr>
+        <w:t xml:space="preserve">Data Inputs</w:t>
+      </w:r>
+    </w:p>
+    <w:p>
+      <w:pPr>
+        <w:rPr>
+          <w:sz w:val="28"/>
+          <w:szCs w:val="28"/>
+        </w:rPr>
+      </w:pPr>
+      <w:r>
+        <w:rPr>
+          <w:rtl w:val="0"/>
+        </w:rPr>
+      </w:r>
+    </w:p>
+    <w:p>
+      <w:pPr>
+        <w:rPr>
+          <w:sz w:val="28"/>
+          <w:szCs w:val="28"/>
+        </w:rPr>
+      </w:pPr>
+      <w:r>
+        <w:rPr>
+          <w:rtl w:val="0"/>
+        </w:rPr>
+      </w:r>
+    </w:p>
+    <w:p>
+      <w:pPr>
+        <w:rPr>
+          <w:sz w:val="26"/>
+          <w:szCs w:val="26"/>
+        </w:rPr>
+      </w:pPr>
+      <w:r>
+        <w:rPr>
+          <w:sz w:val="26"/>
+          <w:szCs w:val="26"/>
+          <w:rtl w:val="0"/>
+        </w:rPr>
+        <w:t xml:space="preserve">Assumptions</w:t>
+      </w:r>
+    </w:p>
+    <w:p>
+      <w:pPr>
+        <w:rPr>
+          <w:sz w:val="26"/>
+          <w:szCs w:val="26"/>
+        </w:rPr>
+      </w:pPr>
+      <w:r>
+        <w:rPr>
+          <w:rtl w:val="0"/>
+        </w:rPr>
+      </w:r>
+    </w:p>
+    <w:p>
+      <w:pPr>
+        <w:rPr>
+          <w:sz w:val="26"/>
+          <w:szCs w:val="26"/>
+        </w:rPr>
+      </w:pPr>
+      <w:r>
+        <w:rPr>
+          <w:rtl w:val="0"/>
+        </w:rPr>
+      </w:r>
+    </w:p>
+    <w:p>
+      <w:pPr>
+        <w:rPr>
+          <w:sz w:val="26"/>
+          <w:szCs w:val="26"/>
+        </w:rPr>
+      </w:pPr>
+      <w:r>
+        <w:rPr>
+          <w:sz w:val="26"/>
+          <w:szCs w:val="26"/>
+          <w:rtl w:val="0"/>
+        </w:rPr>
+        <w:t xml:space="preserve">Constraints</w:t>
+      </w:r>
+    </w:p>
+    <w:p>
+      <w:pPr>
+        <w:rPr>
+          <w:sz w:val="26"/>
+          <w:szCs w:val="26"/>
+        </w:rPr>
+      </w:pPr>
+      <w:r>
+        <w:rPr>
+          <w:rtl w:val="0"/>
+        </w:rPr>
+      </w:r>
+    </w:p>
+    <w:p>
+      <w:pPr>
+        <w:rPr>
+          <w:sz w:val="26"/>
+          <w:szCs w:val="26"/>
+        </w:rPr>
+      </w:pPr>
+      <w:r>
+        <w:rPr>
+          <w:rtl w:val="0"/>
+        </w:rPr>
+      </w:r>
+    </w:p>
+    <w:p>
+      <w:pPr>
+        <w:rPr>
+          <w:sz w:val="28"/>
+          <w:szCs w:val="28"/>
+        </w:rPr>
+      </w:pPr>
+      <w:r>
+        <w:rPr>
+          <w:sz w:val="28"/>
+          <w:szCs w:val="28"/>
+          <w:rtl w:val="0"/>
+        </w:rPr>
+        <w:t xml:space="preserve">Power</w:t>
+      </w:r>
+    </w:p>
+    <w:p>
+      <w:pPr>
+        <w:rPr>
+          <w:sz w:val="26"/>
+          <w:szCs w:val="26"/>
+        </w:rPr>
+      </w:pPr>
+      <w:r>
+        <w:rPr>
+          <w:sz w:val="26"/>
+          <w:szCs w:val="26"/>
+          <w:rtl w:val="0"/>
+        </w:rPr>
+        <w:t xml:space="preserve">Data Inputs</w:t>
+      </w:r>
+    </w:p>
+    <w:p>
+      <w:pPr>
+        <w:rPr>
+          <w:sz w:val="28"/>
+          <w:szCs w:val="28"/>
+        </w:rPr>
+      </w:pPr>
+      <w:r>
+        <w:rPr>
+          <w:rtl w:val="0"/>
+        </w:rPr>
+      </w:r>
+    </w:p>
+    <w:p>
+      <w:pPr>
+        <w:rPr>
+          <w:sz w:val="28"/>
+          <w:szCs w:val="28"/>
+        </w:rPr>
+      </w:pPr>
+      <w:r>
+        <w:rPr>
+          <w:rtl w:val="0"/>
+        </w:rPr>
+      </w:r>
+    </w:p>
+    <w:p>
+      <w:pPr>
+        <w:rPr>
+          <w:sz w:val="26"/>
+          <w:szCs w:val="26"/>
+        </w:rPr>
+      </w:pPr>
+      <w:r>
+        <w:rPr>
+          <w:sz w:val="26"/>
+          <w:szCs w:val="26"/>
+          <w:rtl w:val="0"/>
+        </w:rPr>
+        <w:t xml:space="preserve">Assumptions</w:t>
+      </w:r>
+    </w:p>
+    <w:p>
+      <w:pPr>
+        <w:rPr>
+          <w:sz w:val="26"/>
+          <w:szCs w:val="26"/>
+        </w:rPr>
+      </w:pPr>
+      <w:r>
+        <w:rPr>
+          <w:rtl w:val="0"/>
+        </w:rPr>
+      </w:r>
+    </w:p>
+    <w:p>
+      <w:pPr>
+        <w:rPr>
+          <w:sz w:val="26"/>
+          <w:szCs w:val="26"/>
+        </w:rPr>
+      </w:pPr>
+      <w:r>
+        <w:rPr>
+          <w:rtl w:val="0"/>
+        </w:rPr>
+      </w:r>
+    </w:p>
+    <w:p>
+      <w:pPr>
+        <w:rPr>
+          <w:sz w:val="26"/>
+          <w:szCs w:val="26"/>
+        </w:rPr>
+      </w:pPr>
+      <w:r>
+        <w:rPr>
+          <w:sz w:val="26"/>
+          <w:szCs w:val="26"/>
+          <w:rtl w:val="0"/>
+        </w:rPr>
+        <w:t xml:space="preserve">Constraints</w:t>
+      </w:r>
+    </w:p>
+    <w:p>
+      <w:pPr>
+        <w:rPr>
+          <w:sz w:val="26"/>
+          <w:szCs w:val="26"/>
+        </w:rPr>
+      </w:pPr>
+      <w:r>
+        <w:rPr>
+          <w:rtl w:val="0"/>
+        </w:rPr>
+      </w:r>
+    </w:p>
+    <w:p>
+      <w:pPr>
+        <w:rPr>
+          <w:sz w:val="26"/>
+          <w:szCs w:val="26"/>
+        </w:rPr>
+      </w:pPr>
+      <w:r>
+        <w:rPr>
+          <w:rtl w:val="0"/>
+        </w:rPr>
+      </w:r>
+    </w:p>
+    <w:p>
+      <w:pPr>
+        <w:rPr>
+          <w:sz w:val="30"/>
+          <w:szCs w:val="30"/>
+        </w:rPr>
+      </w:pPr>
+      <w:r>
+        <w:rPr>
+          <w:sz w:val="30"/>
+          <w:szCs w:val="30"/>
+          <w:rtl w:val="0"/>
+        </w:rPr>
+        <w:t xml:space="preserve">Workflow (Descriptive Model) &amp; The Code  </w:t>
+      </w:r>
+    </w:p>
+    <w:p>
+      <w:pPr>
+        <w:rPr>
+          <w:sz w:val="30"/>
+          <w:szCs w:val="30"/>
+        </w:rPr>
+      </w:pPr>
+      <w:r>
+        <w:rPr>
+          <w:rtl w:val="0"/>
+        </w:rPr>
+      </w:r>
+    </w:p>
+    <w:p>
+      <w:pPr>
+        <w:rPr>
+          <w:sz w:val="30"/>
+          <w:szCs w:val="30"/>
+        </w:rPr>
+      </w:pPr>
+      <w:r>
+        <w:rPr>
+          <w:rtl w:val="0"/>
+        </w:rPr>
+      </w:r>
+    </w:p>
+    <w:p>
+      <w:pPr>
+        <w:rPr>
+          <w:sz w:val="30"/>
+          <w:szCs w:val="30"/>
+        </w:rPr>
+      </w:pPr>
+      <w:r>
+        <w:rPr>
+          <w:rtl w:val="0"/>
+        </w:rPr>
+      </w:r>
+    </w:p>
+    <w:p>
+      <w:pPr>
+        <w:rPr>
+          <w:sz w:val="30"/>
+          <w:szCs w:val="30"/>
+        </w:rPr>
+      </w:pPr>
+      <w:r>
+        <w:rPr>
+          <w:sz w:val="30"/>
+          <w:szCs w:val="30"/>
+          <w:rtl w:val="0"/>
+        </w:rPr>
+        <w:t xml:space="preserve">Results/Sensitivities</w:t>
+      </w:r>
+    </w:p>
+    <w:p>
+      <w:pPr>
+        <w:rPr>
+          <w:sz w:val="30"/>
+          <w:szCs w:val="30"/>
+        </w:rPr>
+      </w:pPr>
+      <w:r>
+        <w:rPr>
+          <w:rtl w:val="0"/>
+        </w:rPr>
+      </w:r>
+    </w:p>
+    <w:p>
+      <w:pPr>
+        <w:rPr>
+          <w:sz w:val="30"/>
+          <w:szCs w:val="30"/>
+        </w:rPr>
+      </w:pPr>
+      <w:r>
+        <w:rPr>
+          <w:rtl w:val="0"/>
+        </w:rPr>
+      </w:r>
+    </w:p>
+    <w:p>
+      <w:pPr>
+        <w:rPr>
+          <w:sz w:val="30"/>
+          <w:szCs w:val="30"/>
+        </w:rPr>
+      </w:pPr>
+      <w:r>
+        <w:rPr>
+          <w:rtl w:val="0"/>
+        </w:rPr>
+      </w:r>
+    </w:p>
+    <w:p>
+      <w:pPr>
+        <w:rPr>
+          <w:sz w:val="30"/>
+          <w:szCs w:val="30"/>
+        </w:rPr>
+      </w:pPr>
+      <w:r>
+        <w:rPr>
+          <w:sz w:val="30"/>
+          <w:szCs w:val="30"/>
+          <w:rtl w:val="0"/>
+        </w:rPr>
+        <w:t xml:space="preserve">Analysis</w:t>
+      </w:r>
+    </w:p>
+    <w:p>
+      <w:pPr>
+        <w:rPr>
+          <w:sz w:val="30"/>
+          <w:szCs w:val="30"/>
+        </w:rPr>
+      </w:pPr>
+      <w:r>
+        <w:rPr>
+          <w:rtl w:val="0"/>
+        </w:rPr>
+      </w:r>
+    </w:p>
+    <w:p>
+      <w:pPr>
+        <w:rPr>
+          <w:sz w:val="30"/>
+          <w:szCs w:val="30"/>
+        </w:rPr>
+      </w:pPr>
+      <w:r>
+        <w:rPr>
+          <w:rtl w:val="0"/>
+        </w:rPr>
+      </w:r>
+    </w:p>
+    <w:p>
+      <w:pPr>
+        <w:rPr>
+          <w:sz w:val="30"/>
+          <w:szCs w:val="30"/>
+        </w:rPr>
+      </w:pPr>
+      <w:r>
+        <w:rPr>
+          <w:rtl w:val="0"/>
+        </w:rPr>
+      </w:r>
+    </w:p>
+    <w:p>
+      <w:pPr>
+        <w:rPr>
+          <w:sz w:val="30"/>
+          <w:szCs w:val="30"/>
+        </w:rPr>
+      </w:pPr>
+      <w:r>
+        <w:rPr>
+          <w:sz w:val="30"/>
+          <w:szCs w:val="30"/>
+          <w:rtl w:val="0"/>
+        </w:rPr>
+        <w:t xml:space="preserve">Conclusion</w:t>
       </w:r>
     </w:p>
     <w:sectPr>

</xml_diff>